<commit_message>
menambahkan tombol hapus anggaran, fix urutan sppm, menambahkan polda ntb di polres sppm dan lainya
</commit_message>
<xml_diff>
--- a/resources/templates/sppm/format_sppm_polda.docx
+++ b/resources/templates/sppm/format_sppm_polda.docx
@@ -271,6 +271,13 @@
         </w:rPr>
         <w:tab/>
         <w:t>: BIRO LOGISTIK</w:t>
+      </w:r>
+      <w:r>
+        <w:rPr>
+          <w:rFonts w:ascii="Arial" w:hAnsi="Arial" w:cs="Arial"/>
+          <w:lang w:val="sv-SE"/>
+        </w:rPr>
+        <w:t xml:space="preserve"> POLDA NTB</w:t>
       </w:r>
     </w:p>
     <w:p>

</xml_diff>